<commit_message>
added the rephrases asked
-changed the project name
-rephrased chapter1 problem statement
-rephrased chapter2 related work
- fixed references names
</commit_message>
<xml_diff>
--- a/first_darft/Chapter1+cover.docx
+++ b/first_darft/Chapter1+cover.docx
@@ -1,6 +1,6 @@
 
 <file path=word/document.xml><?xml version="1.0" encoding="utf-8"?>
-<w:document xmlns:wpc="http://schemas.microsoft.com/office/word/2010/wordprocessingCanvas" xmlns:cx="http://schemas.microsoft.com/office/drawing/2014/chartex" xmlns:cx1="http://schemas.microsoft.com/office/drawing/2015/9/8/chartex" xmlns:cx2="http://schemas.microsoft.com/office/drawing/2015/10/21/chartex" xmlns:cx3="http://schemas.microsoft.com/office/drawing/2016/5/9/chartex" xmlns:cx4="http://schemas.microsoft.com/office/drawing/2016/5/10/chartex" xmlns:cx5="http://schemas.microsoft.com/office/drawing/2016/5/11/chartex" xmlns:cx6="http://schemas.microsoft.com/office/drawing/2016/5/12/chartex" xmlns:cx7="http://schemas.microsoft.com/office/drawing/2016/5/13/chartex" xmlns:cx8="http://schemas.microsoft.com/office/drawing/2016/5/14/chartex" xmlns:mc="http://schemas.openxmlformats.org/markup-compatibility/2006" xmlns:aink="http://schemas.microsoft.com/office/drawing/2016/ink" xmlns:am3d="http://schemas.microsoft.com/office/drawing/2017/model3d" xmlns:o="urn:schemas-microsoft-com:office:office" xmlns:r="http://schemas.openxmlformats.org/officeDocument/2006/relationships" xmlns:m="http://schemas.openxmlformats.org/officeDocument/2006/math" xmlns:v="urn:schemas-microsoft-com:vml" xmlns:wp14="http://schemas.microsoft.com/office/word/2010/wordprocessingDrawing" xmlns:wp="http://schemas.openxmlformats.org/drawingml/2006/wordprocessingDrawing" xmlns:w10="urn:schemas-microsoft-com:office:word" xmlns:w="http://schemas.openxmlformats.org/wordprocessingml/2006/main" xmlns:w14="http://schemas.microsoft.com/office/word/2010/wordml" xmlns:w15="http://schemas.microsoft.com/office/word/2012/wordml" xmlns:w16cex="http://schemas.microsoft.com/office/word/2018/wordml/cex" xmlns:w16cid="http://schemas.microsoft.com/office/word/2016/wordml/cid" xmlns:w16="http://schemas.microsoft.com/office/word/2018/wordml" xmlns:w16sdtdh="http://schemas.microsoft.com/office/word/2020/wordml/sdtdatahash" xmlns:w16se="http://schemas.microsoft.com/office/word/2015/wordml/symex" xmlns:wpg="http://schemas.microsoft.com/office/word/2010/wordprocessingGroup" xmlns:wpi="http://schemas.microsoft.com/office/word/2010/wordprocessingInk" xmlns:wne="http://schemas.microsoft.com/office/word/2006/wordml" xmlns:wps="http://schemas.microsoft.com/office/word/2010/wordprocessingShape" mc:Ignorable="w14 w15 w16se w16cid w16 w16cex w16sdtdh wp14">
+<w:document xmlns:wpc="http://schemas.microsoft.com/office/word/2010/wordprocessingCanvas" xmlns:cx="http://schemas.microsoft.com/office/drawing/2014/chartex" xmlns:cx1="http://schemas.microsoft.com/office/drawing/2015/9/8/chartex" xmlns:cx2="http://schemas.microsoft.com/office/drawing/2015/10/21/chartex" xmlns:cx3="http://schemas.microsoft.com/office/drawing/2016/5/9/chartex" xmlns:cx4="http://schemas.microsoft.com/office/drawing/2016/5/10/chartex" xmlns:cx5="http://schemas.microsoft.com/office/drawing/2016/5/11/chartex" xmlns:cx6="http://schemas.microsoft.com/office/drawing/2016/5/12/chartex" xmlns:cx7="http://schemas.microsoft.com/office/drawing/2016/5/13/chartex" xmlns:cx8="http://schemas.microsoft.com/office/drawing/2016/5/14/chartex" xmlns:mc="http://schemas.openxmlformats.org/markup-compatibility/2006" xmlns:aink="http://schemas.microsoft.com/office/drawing/2016/ink" xmlns:am3d="http://schemas.microsoft.com/office/drawing/2017/model3d" xmlns:o="urn:schemas-microsoft-com:office:office" xmlns:oel="http://schemas.microsoft.com/office/2019/extlst" xmlns:r="http://schemas.openxmlformats.org/officeDocument/2006/relationships" xmlns:m="http://schemas.openxmlformats.org/officeDocument/2006/math" xmlns:v="urn:schemas-microsoft-com:vml" xmlns:wp14="http://schemas.microsoft.com/office/word/2010/wordprocessingDrawing" xmlns:wp="http://schemas.openxmlformats.org/drawingml/2006/wordprocessingDrawing" xmlns:w10="urn:schemas-microsoft-com:office:word" xmlns:w="http://schemas.openxmlformats.org/wordprocessingml/2006/main" xmlns:w14="http://schemas.microsoft.com/office/word/2010/wordml" xmlns:w15="http://schemas.microsoft.com/office/word/2012/wordml" xmlns:w16cex="http://schemas.microsoft.com/office/word/2018/wordml/cex" xmlns:w16cid="http://schemas.microsoft.com/office/word/2016/wordml/cid" xmlns:w16="http://schemas.microsoft.com/office/word/2018/wordml" xmlns:w16sdtdh="http://schemas.microsoft.com/office/word/2020/wordml/sdtdatahash" xmlns:w16se="http://schemas.microsoft.com/office/word/2015/wordml/symex" xmlns:wpg="http://schemas.microsoft.com/office/word/2010/wordprocessingGroup" xmlns:wpi="http://schemas.microsoft.com/office/word/2010/wordprocessingInk" xmlns:wne="http://schemas.microsoft.com/office/word/2006/wordml" xmlns:wps="http://schemas.microsoft.com/office/word/2010/wordprocessingShape" mc:Ignorable="w14 w15 w16se w16cid w16 w16cex w16sdtdh wp14">
   <w:body>
     <w:p>
       <w:pPr>
@@ -355,66 +355,28 @@
     </w:p>
     <w:p>
       <w:pPr>
+        <w:pStyle w:val="Title"/>
         <w:bidi w:val="0"/>
         <w:jc w:val="center"/>
         <w:rPr>
-          <w:rFonts w:cstheme="majorBidi"/>
-          <w:b/>
-          <w:bCs/>
-          <w:sz w:val="48"/>
-          <w:szCs w:val="48"/>
-          <w:u w:val="single"/>
+          <w:rFonts w:asciiTheme="majorBidi" w:hAnsiTheme="majorBidi"/>
+          <w:b/>
+          <w:bCs/>
+          <w:sz w:val="64"/>
+          <w:szCs w:val="64"/>
           <w:lang w:val="en-GB"/>
         </w:rPr>
       </w:pPr>
       <w:r>
         <w:rPr>
-          <w:rFonts w:cstheme="majorBidi"/>
-          <w:b/>
-          <w:bCs/>
-          <w:sz w:val="48"/>
-          <w:szCs w:val="48"/>
-        </w:rPr>
-        <w:t xml:space="preserve">UNIVERSITY </w:t>
-      </w:r>
-      <w:r>
-        <w:rPr>
-          <w:rFonts w:cstheme="majorBidi"/>
-          <w:b/>
-          <w:bCs/>
-          <w:sz w:val="48"/>
-          <w:szCs w:val="48"/>
-        </w:rPr>
-        <w:t>LECTURES</w:t>
-      </w:r>
-      <w:r>
-        <w:rPr>
-          <w:rFonts w:cstheme="majorBidi"/>
-          <w:b/>
-          <w:bCs/>
-          <w:sz w:val="48"/>
-          <w:szCs w:val="48"/>
-        </w:rPr>
-        <w:t xml:space="preserve"> SCHEDULER USING GENETIC ALGORITHM</w:t>
-      </w:r>
-    </w:p>
-    <w:p>
-      <w:pPr>
-        <w:autoSpaceDE w:val="0"/>
-        <w:autoSpaceDN w:val="0"/>
-        <w:bidi w:val="0"/>
-        <w:adjustRightInd w:val="0"/>
-        <w:spacing w:after="0" w:line="240" w:lineRule="auto"/>
-        <w:jc w:val="center"/>
-        <w:rPr>
-          <w:rFonts w:ascii="Times New Roman" w:hAnsi="Times New Roman" w:cs="Times New Roman"/>
-          <w:b/>
-          <w:bCs/>
-          <w:sz w:val="32"/>
-          <w:szCs w:val="32"/>
-          <w:lang w:val="en-GB"/>
-        </w:rPr>
-      </w:pPr>
+          <w:rFonts w:asciiTheme="majorBidi" w:hAnsiTheme="majorBidi"/>
+          <w:b/>
+          <w:bCs/>
+          <w:sz w:val="64"/>
+          <w:szCs w:val="64"/>
+        </w:rPr>
+        <w:t>University lecture timetable scheduling</w:t>
+      </w:r>
     </w:p>
     <w:p>
       <w:pPr>
@@ -852,6 +814,7 @@
           <w:sz w:val="24"/>
           <w:szCs w:val="36"/>
         </w:rPr>
+        <w:lastRenderedPageBreak/>
         <w:t xml:space="preserve">Chapter </w:t>
       </w:r>
       <w:r>
@@ -885,11 +848,6 @@
         <w:t>Introduction</w:t>
       </w:r>
       <w:bookmarkEnd w:id="0"/>
-    </w:p>
-    <w:p>
-      <w:pPr>
-        <w:bidi w:val="0"/>
-      </w:pPr>
     </w:p>
     <w:p>
       <w:pPr>
@@ -920,21 +878,16 @@
         <w:jc w:val="both"/>
       </w:pPr>
       <w:r>
-        <w:t xml:space="preserve">Today we are progressing in science and technology and </w:t>
-      </w:r>
-      <w:proofErr w:type="spellStart"/>
-      <w:r>
-        <w:t>every thing</w:t>
-      </w:r>
-      <w:proofErr w:type="spellEnd"/>
-      <w:r>
-        <w:t xml:space="preserve"> is moving towards automation</w:t>
-      </w:r>
-      <w:r>
-        <w:t xml:space="preserve"> a</w:t>
-      </w:r>
-      <w:r>
-        <w:t>nd large portion of this technolog</w:t>
+        <w:t>Today we are progressing in science and technology and everything is moving towards automation</w:t>
+      </w:r>
+      <w:r>
+        <w:t xml:space="preserve"> </w:t>
+      </w:r>
+      <w:r>
+        <w:t xml:space="preserve">a </w:t>
+      </w:r>
+      <w:r>
+        <w:t>large portion of this technolog</w:t>
       </w:r>
       <w:r>
         <w:t>y</w:t>
@@ -976,7 +929,13 @@
         <w:t xml:space="preserve"> </w:t>
       </w:r>
       <w:r>
-        <w:t>real life problems</w:t>
+        <w:t>real</w:t>
+      </w:r>
+      <w:r>
+        <w:t>-</w:t>
+      </w:r>
+      <w:r>
+        <w:t>life problems</w:t>
       </w:r>
       <w:r>
         <w:t>, which</w:t>
@@ -1023,97 +982,120 @@
       <w:r>
         <w:t xml:space="preserve">present so you can determine the solution with no </w:t>
       </w:r>
-      <w:proofErr w:type="spellStart"/>
-      <w:r>
-        <w:rPr>
-          <w:highlight w:val="yellow"/>
-        </w:rPr>
-        <w:t>diffeculties</w:t>
-      </w:r>
-      <w:proofErr w:type="spellEnd"/>
+      <w:r>
+        <w:t>diff</w:t>
+      </w:r>
+      <w:r>
+        <w:t>i</w:t>
+      </w:r>
+      <w:r>
+        <w:t>culties</w:t>
+      </w:r>
       <w:r>
         <w:t xml:space="preserve">. </w:t>
       </w:r>
       <w:r>
-        <w:t>Second</w:t>
+        <w:t>The s</w:t>
+      </w:r>
+      <w:r>
+        <w:t>econd</w:t>
+      </w:r>
+      <w:r>
+        <w:t xml:space="preserve"> category</w:t>
       </w:r>
       <w:r>
         <w:t xml:space="preserve"> </w:t>
       </w:r>
-      <w:proofErr w:type="gramStart"/>
-      <w:r>
-        <w:t xml:space="preserve">category </w:t>
+      <w:r>
+        <w:t xml:space="preserve">is the </w:t>
+      </w:r>
+      <w:r>
+        <w:rPr>
+          <w:b/>
+          <w:bCs/>
+        </w:rPr>
+        <w:t>non-deterministic</w:t>
+      </w:r>
+      <w:r>
+        <w:t xml:space="preserve"> problems where there is the factor of randomness so finding a solution will be </w:t>
+      </w:r>
+      <w:r>
+        <w:t xml:space="preserve">a </w:t>
+      </w:r>
+      <w:r>
+        <w:t xml:space="preserve">more complex task also </w:t>
+      </w:r>
+      <w:r>
+        <w:t>where there are too many possibilities to find a solution. T</w:t>
+      </w:r>
+      <w:r>
+        <w:t xml:space="preserve">his </w:t>
+      </w:r>
+      <w:r>
+        <w:t xml:space="preserve">is </w:t>
+      </w:r>
+      <w:r>
+        <w:t xml:space="preserve">because of the large pool of spaces </w:t>
+      </w:r>
+      <w:r>
+        <w:t>for</w:t>
+      </w:r>
+      <w:r>
+        <w:t xml:space="preserve"> solutions, and handling such large spaces </w:t>
+      </w:r>
+      <w:r>
+        <w:t>concerning</w:t>
+      </w:r>
+      <w:r>
+        <w:t xml:space="preserve"> certain circumstances or constrain</w:t>
+      </w:r>
+      <w:r>
+        <w:t>t</w:t>
+      </w:r>
+      <w:r>
+        <w:t xml:space="preserve">s will be </w:t>
+      </w:r>
+      <w:r>
+        <w:t>ext</w:t>
+      </w:r>
+      <w:r>
+        <w:t>reme</w:t>
+      </w:r>
+      <w:r>
+        <w:t>ly</w:t>
+      </w:r>
+      <w:r>
+        <w:t xml:space="preserve"> diff</w:t>
+      </w:r>
+      <w:r>
+        <w:t>i</w:t>
+      </w:r>
+      <w:r>
+        <w:t>cult</w:t>
+      </w:r>
+      <w:r>
+        <w:t xml:space="preserve">. Here comes the automation part where you can teach a machine to do </w:t>
+      </w:r>
+      <w:r>
+        <w:t>large</w:t>
+      </w:r>
+      <w:r>
+        <w:t xml:space="preserve"> task</w:t>
+      </w:r>
+      <w:r>
+        <w:t>s</w:t>
       </w:r>
       <w:r>
         <w:t xml:space="preserve"> </w:t>
       </w:r>
       <w:r>
-        <w:t>is</w:t>
-      </w:r>
-      <w:proofErr w:type="gramEnd"/>
-      <w:r>
-        <w:t xml:space="preserve"> the </w:t>
-      </w:r>
-      <w:r>
-        <w:rPr>
-          <w:b/>
-          <w:bCs/>
-        </w:rPr>
-        <w:t>non-deterministic</w:t>
-      </w:r>
-      <w:r>
-        <w:t xml:space="preserve"> problems where there is the factor of randomness so finding a solution will be more complex task also </w:t>
-      </w:r>
-      <w:r>
-        <w:t>where there are too many possibilities to find a solution. T</w:t>
-      </w:r>
-      <w:r>
-        <w:t xml:space="preserve">his </w:t>
-      </w:r>
-      <w:r>
-        <w:t xml:space="preserve">is </w:t>
-      </w:r>
-      <w:r>
-        <w:t xml:space="preserve">because of the large pool of spaces of solutions, and handling such large spaces with respect to some certain circumstances or constrains will be </w:t>
-      </w:r>
-      <w:proofErr w:type="spellStart"/>
-      <w:r>
-        <w:rPr>
-          <w:highlight w:val="yellow"/>
-        </w:rPr>
-        <w:t>exteremly</w:t>
-      </w:r>
-      <w:proofErr w:type="spellEnd"/>
-      <w:r>
-        <w:t xml:space="preserve"> </w:t>
-      </w:r>
-      <w:proofErr w:type="spellStart"/>
-      <w:r>
-        <w:t>diffecult</w:t>
-      </w:r>
-      <w:proofErr w:type="spellEnd"/>
-      <w:r>
-        <w:t xml:space="preserve">. Here comes the automation part where you can teach a machine to do a </w:t>
-      </w:r>
-      <w:proofErr w:type="gramStart"/>
-      <w:r>
-        <w:t>large</w:t>
-      </w:r>
-      <w:r>
-        <w:t xml:space="preserve"> task</w:t>
-      </w:r>
-      <w:r>
-        <w:t>s</w:t>
-      </w:r>
-      <w:proofErr w:type="gramEnd"/>
-      <w:r>
-        <w:t xml:space="preserve"> </w:t>
-      </w:r>
-      <w:r>
         <w:t>and</w:t>
       </w:r>
       <w:r>
-        <w:t xml:space="preserve"> repeat it</w:t>
+        <w:t xml:space="preserve"> repeat </w:t>
+      </w:r>
+      <w:r>
+        <w:t>them</w:t>
       </w:r>
       <w:r>
         <w:t xml:space="preserve"> thousands </w:t>
@@ -1125,7 +1107,13 @@
         <w:t xml:space="preserve"> so the </w:t>
       </w:r>
       <w:r>
-        <w:t>near optimal</w:t>
+        <w:t>near</w:t>
+      </w:r>
+      <w:r>
+        <w:t>-</w:t>
+      </w:r>
+      <w:r>
+        <w:t>optimal</w:t>
       </w:r>
       <w:r>
         <w:t xml:space="preserve"> </w:t>
@@ -1163,135 +1151,20 @@
         <w:spacing w:line="360" w:lineRule="auto"/>
       </w:pPr>
       <w:r>
-        <w:t>For each semester</w:t>
-      </w:r>
-      <w:r>
-        <w:t xml:space="preserve"> universities</w:t>
-      </w:r>
-      <w:r>
-        <w:t xml:space="preserve"> </w:t>
-      </w:r>
-      <w:r>
-        <w:t xml:space="preserve">make schedules for their </w:t>
-      </w:r>
-      <w:r>
-        <w:t>l</w:t>
-      </w:r>
-      <w:r>
-        <w:t>ectu</w:t>
-      </w:r>
-      <w:r>
-        <w:t>res. T</w:t>
-      </w:r>
-      <w:r>
-        <w:t xml:space="preserve">his process </w:t>
-      </w:r>
-      <w:r>
-        <w:t>is</w:t>
-      </w:r>
-      <w:r>
-        <w:t xml:space="preserve"> done manually and </w:t>
-      </w:r>
-      <w:r>
-        <w:t>it</w:t>
-      </w:r>
-      <w:r>
-        <w:t xml:space="preserve"> is</w:t>
-      </w:r>
-      <w:r>
-        <w:t xml:space="preserve"> no</w:t>
-      </w:r>
-      <w:r>
-        <w:t>t an</w:t>
-      </w:r>
-      <w:r>
-        <w:t xml:space="preserve"> easy job due to </w:t>
-      </w:r>
-      <w:r>
-        <w:t>the</w:t>
-      </w:r>
-      <w:r>
-        <w:t xml:space="preserve"> large </w:t>
-      </w:r>
-      <w:r>
-        <w:t>number</w:t>
-      </w:r>
-      <w:r>
-        <w:t xml:space="preserve"> of </w:t>
-      </w:r>
-      <w:r>
-        <w:rPr>
-          <w:highlight w:val="yellow"/>
-        </w:rPr>
-        <w:t>aspects</w:t>
-      </w:r>
-      <w:r>
-        <w:t xml:space="preserve"> </w:t>
-      </w:r>
-      <w:r>
-        <w:t xml:space="preserve">that </w:t>
-      </w:r>
-      <w:r>
-        <w:t xml:space="preserve">must be arranged like lectures, rooms used for lectures, </w:t>
-      </w:r>
-      <w:r>
-        <w:t xml:space="preserve">and </w:t>
-      </w:r>
-      <w:r>
-        <w:t>period of</w:t>
-      </w:r>
-      <w:r>
-        <w:t xml:space="preserve"> lectures</w:t>
-      </w:r>
-      <w:r>
-        <w:t xml:space="preserve"> </w:t>
-      </w:r>
-      <w:r>
-        <w:t>causing a lot of conflicts and with these conflicts</w:t>
+        <w:t>In each semester, the universities create their lecture schedules. This process is done manually and it is not easy due to the many aspects that must be considered and taken into account</w:t>
+      </w:r>
+      <w:r>
+        <w:t>s</w:t>
+      </w:r>
+      <w:r>
+        <w:t>, such as lectures, appropriate halls, time of lectures</w:t>
       </w:r>
       <w:r>
         <w:t>,</w:t>
       </w:r>
       <w:r>
-        <w:t xml:space="preserve"> a lot</w:t>
-      </w:r>
-      <w:r>
-        <w:t xml:space="preserve"> of</w:t>
-      </w:r>
-      <w:r>
-        <w:t xml:space="preserve"> time is wasted,</w:t>
-      </w:r>
-      <w:r>
-        <w:t xml:space="preserve"> </w:t>
-      </w:r>
-      <w:r>
-        <w:rPr>
-          <w:highlight w:val="yellow"/>
-        </w:rPr>
-        <w:t>so when the schedule is done it will possibly not the most optimized one, and no one will attempt to optimize it cause it’s a lot of work, so they will just agree on the current schedule even if it’s not acceptable by all parties associated with it,</w:t>
-      </w:r>
-      <w:r>
-        <w:t xml:space="preserve"> Here our problem arises in our university this problem has been a major one of the longest time and with circumstances of our country we were forced to change the schedule sometime more than once making it less optimized with each time it was redone.</w:t>
-      </w:r>
-    </w:p>
-    <w:p>
-      <w:pPr>
-        <w:bidi w:val="0"/>
-        <w:spacing w:line="360" w:lineRule="auto"/>
-      </w:pPr>
-    </w:p>
-    <w:p>
-      <w:pPr>
-        <w:bidi w:val="0"/>
-        <w:spacing w:line="360" w:lineRule="auto"/>
-        <w:rPr>
-          <w:rFonts w:eastAsiaTheme="majorEastAsia" w:cstheme="majorBidi"/>
-          <w:b/>
-          <w:bCs/>
-          <w:sz w:val="26"/>
-          <w:szCs w:val="32"/>
-        </w:rPr>
-      </w:pPr>
+        <w:t xml:space="preserve"> and others. There is a possibility to improve these schedules and come up with more satisfactory results, but it takes effort and a long time that exceeds the ability of the average person. Here the problem lies in creating schedules that are free of conflicts and adequately meet the demands of faculty and students.</w:t>
+      </w:r>
     </w:p>
     <w:p>
       <w:pPr>
@@ -1318,11 +1191,9 @@
       <w:r>
         <w:t xml:space="preserve"> of this project </w:t>
       </w:r>
-      <w:proofErr w:type="gramStart"/>
-      <w:r>
-        <w:t>is</w:t>
-      </w:r>
-      <w:proofErr w:type="gramEnd"/>
+      <w:r>
+        <w:t>are</w:t>
+      </w:r>
       <w:r>
         <w:t xml:space="preserve"> to create a </w:t>
       </w:r>
@@ -1347,7 +1218,6 @@
         <w:spacing w:line="360" w:lineRule="auto"/>
       </w:pPr>
       <w:r>
-        <w:lastRenderedPageBreak/>
         <w:t xml:space="preserve">Generating </w:t>
       </w:r>
       <w:r>
@@ -1418,7 +1288,13 @@
         <w:t>Reducing the time and effort taken to create the schedules</w:t>
       </w:r>
       <w:r>
-        <w:t xml:space="preserve"> by transforming the manual task to automated one</w:t>
+        <w:t xml:space="preserve"> by transforming the manual task to </w:t>
+      </w:r>
+      <w:r>
+        <w:t xml:space="preserve">an </w:t>
+      </w:r>
+      <w:r>
+        <w:t>automated one</w:t>
       </w:r>
       <w:r>
         <w:t>.</w:t>
@@ -1448,214 +1324,204 @@
           <w:rFonts w:cstheme="majorBidi"/>
           <w:szCs w:val="24"/>
         </w:rPr>
-        <w:t>This project will be implemented in</w:t>
+        <w:t xml:space="preserve">This project will be implemented </w:t>
       </w:r>
       <w:r>
         <w:rPr>
           <w:rFonts w:cstheme="majorBidi"/>
           <w:szCs w:val="24"/>
         </w:rPr>
+        <w:t>at</w:t>
+      </w:r>
+      <w:r>
+        <w:rPr>
+          <w:rFonts w:cstheme="majorBidi"/>
+          <w:szCs w:val="24"/>
+        </w:rPr>
+        <w:t xml:space="preserve"> Had</w:t>
+      </w:r>
+      <w:r>
+        <w:rPr>
+          <w:rFonts w:cstheme="majorBidi"/>
+          <w:szCs w:val="24"/>
+        </w:rPr>
+        <w:t>h</w:t>
+      </w:r>
+      <w:r>
+        <w:rPr>
+          <w:rFonts w:cstheme="majorBidi"/>
+          <w:szCs w:val="24"/>
+        </w:rPr>
+        <w:t>ramout</w:t>
+      </w:r>
+      <w:r>
+        <w:rPr>
+          <w:rFonts w:cstheme="majorBidi"/>
+          <w:szCs w:val="24"/>
+        </w:rPr>
+        <w:t xml:space="preserve"> university</w:t>
+      </w:r>
+      <w:r>
+        <w:rPr>
+          <w:rFonts w:cstheme="majorBidi"/>
+          <w:szCs w:val="24"/>
+        </w:rPr>
+        <w:t xml:space="preserve">, but also other universities can </w:t>
+      </w:r>
+      <w:r>
+        <w:rPr>
+          <w:rFonts w:cstheme="majorBidi"/>
+          <w:szCs w:val="24"/>
+        </w:rPr>
+        <w:t>adapt</w:t>
+      </w:r>
+      <w:r>
+        <w:rPr>
+          <w:rFonts w:cstheme="majorBidi"/>
+          <w:szCs w:val="24"/>
+        </w:rPr>
+        <w:t xml:space="preserve"> it for their </w:t>
+      </w:r>
+      <w:r>
+        <w:rPr>
+          <w:rFonts w:cstheme="majorBidi"/>
+          <w:szCs w:val="24"/>
+        </w:rPr>
+        <w:t>use</w:t>
+      </w:r>
+      <w:r>
+        <w:rPr>
+          <w:rFonts w:cstheme="majorBidi"/>
+          <w:szCs w:val="24"/>
+        </w:rPr>
+        <w:t>. Firstly,</w:t>
+      </w:r>
+      <w:r>
+        <w:rPr>
+          <w:rFonts w:cstheme="majorBidi"/>
+          <w:szCs w:val="24"/>
+        </w:rPr>
         <w:t xml:space="preserve"> </w:t>
       </w:r>
-      <w:proofErr w:type="spellStart"/>
       <w:r>
         <w:rPr>
           <w:rFonts w:cstheme="majorBidi"/>
           <w:szCs w:val="24"/>
         </w:rPr>
-        <w:t>Had</w:t>
+        <w:t>the project</w:t>
       </w:r>
       <w:r>
         <w:rPr>
           <w:rFonts w:cstheme="majorBidi"/>
           <w:szCs w:val="24"/>
         </w:rPr>
-        <w:t>h</w:t>
+        <w:t xml:space="preserve"> will be tested</w:t>
       </w:r>
       <w:r>
         <w:rPr>
           <w:rFonts w:cstheme="majorBidi"/>
           <w:szCs w:val="24"/>
         </w:rPr>
-        <w:t>ramout</w:t>
-      </w:r>
-      <w:proofErr w:type="spellEnd"/>
+        <w:t xml:space="preserve"> in</w:t>
+      </w:r>
       <w:r>
         <w:rPr>
           <w:rFonts w:cstheme="majorBidi"/>
           <w:szCs w:val="24"/>
         </w:rPr>
-        <w:t xml:space="preserve"> university</w:t>
+        <w:t xml:space="preserve"> </w:t>
       </w:r>
       <w:r>
         <w:rPr>
           <w:rFonts w:cstheme="majorBidi"/>
           <w:szCs w:val="24"/>
         </w:rPr>
-        <w:t xml:space="preserve">, but also other universities can </w:t>
+        <w:t xml:space="preserve">the </w:t>
       </w:r>
       <w:r>
         <w:rPr>
           <w:rFonts w:cstheme="majorBidi"/>
           <w:szCs w:val="24"/>
         </w:rPr>
-        <w:t>adapt</w:t>
+        <w:t>college of engineering and petroleum</w:t>
       </w:r>
       <w:r>
         <w:rPr>
           <w:rFonts w:cstheme="majorBidi"/>
           <w:szCs w:val="24"/>
         </w:rPr>
-        <w:t xml:space="preserve"> it for their </w:t>
+        <w:t xml:space="preserve"> wh</w:t>
       </w:r>
       <w:r>
         <w:rPr>
           <w:rFonts w:cstheme="majorBidi"/>
           <w:szCs w:val="24"/>
         </w:rPr>
-        <w:t>use</w:t>
+        <w:t>ich</w:t>
       </w:r>
       <w:r>
         <w:rPr>
           <w:rFonts w:cstheme="majorBidi"/>
           <w:szCs w:val="24"/>
         </w:rPr>
-        <w:t>.  Firstly,</w:t>
+        <w:t xml:space="preserve"> </w:t>
       </w:r>
       <w:r>
         <w:rPr>
           <w:rFonts w:cstheme="majorBidi"/>
           <w:szCs w:val="24"/>
         </w:rPr>
-        <w:t xml:space="preserve"> </w:t>
+        <w:t xml:space="preserve">allow </w:t>
       </w:r>
       <w:r>
         <w:rPr>
           <w:rFonts w:cstheme="majorBidi"/>
           <w:szCs w:val="24"/>
         </w:rPr>
-        <w:t>the project</w:t>
+        <w:t xml:space="preserve">the </w:t>
       </w:r>
       <w:r>
         <w:rPr>
           <w:rFonts w:cstheme="majorBidi"/>
           <w:szCs w:val="24"/>
         </w:rPr>
-        <w:t xml:space="preserve"> will be tested</w:t>
+        <w:t xml:space="preserve">department to </w:t>
       </w:r>
       <w:r>
         <w:rPr>
           <w:rFonts w:cstheme="majorBidi"/>
           <w:szCs w:val="24"/>
         </w:rPr>
-        <w:t xml:space="preserve"> in</w:t>
+        <w:t xml:space="preserve">create </w:t>
       </w:r>
       <w:r>
         <w:rPr>
           <w:rFonts w:cstheme="majorBidi"/>
           <w:szCs w:val="24"/>
         </w:rPr>
-        <w:t xml:space="preserve"> </w:t>
+        <w:t>its</w:t>
       </w:r>
       <w:r>
         <w:rPr>
           <w:rFonts w:cstheme="majorBidi"/>
           <w:szCs w:val="24"/>
         </w:rPr>
-        <w:t xml:space="preserve">the </w:t>
+        <w:t xml:space="preserve"> semester schedule as they </w:t>
       </w:r>
       <w:r>
         <w:rPr>
           <w:rFonts w:cstheme="majorBidi"/>
           <w:szCs w:val="24"/>
         </w:rPr>
-        <w:t>college of engineering and petroleum</w:t>
+        <w:t>need</w:t>
       </w:r>
       <w:r>
         <w:rPr>
           <w:rFonts w:cstheme="majorBidi"/>
           <w:szCs w:val="24"/>
         </w:rPr>
-        <w:t xml:space="preserve"> wh</w:t>
-      </w:r>
-      <w:r>
-        <w:rPr>
-          <w:rFonts w:cstheme="majorBidi"/>
-          <w:szCs w:val="24"/>
-        </w:rPr>
-        <w:t>ich</w:t>
-      </w:r>
-      <w:r>
-        <w:rPr>
-          <w:rFonts w:cstheme="majorBidi"/>
-          <w:szCs w:val="24"/>
-        </w:rPr>
-        <w:t xml:space="preserve"> </w:t>
-      </w:r>
-      <w:r>
-        <w:rPr>
-          <w:rFonts w:cstheme="majorBidi"/>
-          <w:szCs w:val="24"/>
-        </w:rPr>
-        <w:t xml:space="preserve">allow department to </w:t>
-      </w:r>
-      <w:r>
-        <w:rPr>
-          <w:rFonts w:cstheme="majorBidi"/>
-          <w:szCs w:val="24"/>
-        </w:rPr>
-        <w:t xml:space="preserve">create </w:t>
-      </w:r>
-      <w:proofErr w:type="spellStart"/>
-      <w:r>
-        <w:rPr>
-          <w:rFonts w:cstheme="majorBidi"/>
-          <w:szCs w:val="24"/>
-        </w:rPr>
-        <w:t>th</w:t>
-      </w:r>
-      <w:r>
-        <w:rPr>
-          <w:rFonts w:cstheme="majorBidi"/>
-          <w:szCs w:val="24"/>
-        </w:rPr>
-        <w:t>ier</w:t>
-      </w:r>
-      <w:proofErr w:type="spellEnd"/>
-      <w:r>
-        <w:rPr>
-          <w:rFonts w:cstheme="majorBidi"/>
-          <w:szCs w:val="24"/>
-        </w:rPr>
-        <w:t xml:space="preserve"> semester schedule as they </w:t>
-      </w:r>
-      <w:r>
-        <w:rPr>
-          <w:rFonts w:cstheme="majorBidi"/>
-          <w:szCs w:val="24"/>
-        </w:rPr>
-        <w:t>need</w:t>
-      </w:r>
-      <w:r>
-        <w:rPr>
-          <w:rFonts w:cstheme="majorBidi"/>
-          <w:szCs w:val="24"/>
-        </w:rPr>
         <w:t>.</w:t>
       </w:r>
-    </w:p>
-    <w:p>
-      <w:pPr>
-        <w:pStyle w:val="Heading2"/>
-        <w:numPr>
-          <w:ilvl w:val="0"/>
-          <w:numId w:val="0"/>
-        </w:numPr>
-        <w:bidi w:val="0"/>
-        <w:spacing w:line="360" w:lineRule="auto"/>
-        <w:ind w:left="576" w:hanging="576"/>
-        <w:jc w:val="left"/>
-      </w:pPr>
     </w:p>
     <w:sectPr>
       <w:headerReference w:type="even" r:id="rId11"/>
@@ -1676,7 +1542,7 @@
 </file>
 
 <file path=word/endnotes.xml><?xml version="1.0" encoding="utf-8"?>
-<w:endnotes xmlns:wpc="http://schemas.microsoft.com/office/word/2010/wordprocessingCanvas" xmlns:cx="http://schemas.microsoft.com/office/drawing/2014/chartex" xmlns:cx1="http://schemas.microsoft.com/office/drawing/2015/9/8/chartex" xmlns:cx2="http://schemas.microsoft.com/office/drawing/2015/10/21/chartex" xmlns:cx3="http://schemas.microsoft.com/office/drawing/2016/5/9/chartex" xmlns:cx4="http://schemas.microsoft.com/office/drawing/2016/5/10/chartex" xmlns:cx5="http://schemas.microsoft.com/office/drawing/2016/5/11/chartex" xmlns:cx6="http://schemas.microsoft.com/office/drawing/2016/5/12/chartex" xmlns:cx7="http://schemas.microsoft.com/office/drawing/2016/5/13/chartex" xmlns:cx8="http://schemas.microsoft.com/office/drawing/2016/5/14/chartex" xmlns:mc="http://schemas.openxmlformats.org/markup-compatibility/2006" xmlns:aink="http://schemas.microsoft.com/office/drawing/2016/ink" xmlns:am3d="http://schemas.microsoft.com/office/drawing/2017/model3d" xmlns:o="urn:schemas-microsoft-com:office:office" xmlns:r="http://schemas.openxmlformats.org/officeDocument/2006/relationships" xmlns:m="http://schemas.openxmlformats.org/officeDocument/2006/math" xmlns:v="urn:schemas-microsoft-com:vml" xmlns:wp14="http://schemas.microsoft.com/office/word/2010/wordprocessingDrawing" xmlns:wp="http://schemas.openxmlformats.org/drawingml/2006/wordprocessingDrawing" xmlns:w10="urn:schemas-microsoft-com:office:word" xmlns:w="http://schemas.openxmlformats.org/wordprocessingml/2006/main" xmlns:w14="http://schemas.microsoft.com/office/word/2010/wordml" xmlns:w15="http://schemas.microsoft.com/office/word/2012/wordml" xmlns:w16cex="http://schemas.microsoft.com/office/word/2018/wordml/cex" xmlns:w16cid="http://schemas.microsoft.com/office/word/2016/wordml/cid" xmlns:w16="http://schemas.microsoft.com/office/word/2018/wordml" xmlns:w16sdtdh="http://schemas.microsoft.com/office/word/2020/wordml/sdtdatahash" xmlns:w16se="http://schemas.microsoft.com/office/word/2015/wordml/symex" xmlns:wpg="http://schemas.microsoft.com/office/word/2010/wordprocessingGroup" xmlns:wpi="http://schemas.microsoft.com/office/word/2010/wordprocessingInk" xmlns:wne="http://schemas.microsoft.com/office/word/2006/wordml" xmlns:wps="http://schemas.microsoft.com/office/word/2010/wordprocessingShape" mc:Ignorable="w14 w15 w16se w16cid w16 w16cex w16sdtdh wp14">
+<w:endnotes xmlns:wpc="http://schemas.microsoft.com/office/word/2010/wordprocessingCanvas" xmlns:cx="http://schemas.microsoft.com/office/drawing/2014/chartex" xmlns:cx1="http://schemas.microsoft.com/office/drawing/2015/9/8/chartex" xmlns:cx2="http://schemas.microsoft.com/office/drawing/2015/10/21/chartex" xmlns:cx3="http://schemas.microsoft.com/office/drawing/2016/5/9/chartex" xmlns:cx4="http://schemas.microsoft.com/office/drawing/2016/5/10/chartex" xmlns:cx5="http://schemas.microsoft.com/office/drawing/2016/5/11/chartex" xmlns:cx6="http://schemas.microsoft.com/office/drawing/2016/5/12/chartex" xmlns:cx7="http://schemas.microsoft.com/office/drawing/2016/5/13/chartex" xmlns:cx8="http://schemas.microsoft.com/office/drawing/2016/5/14/chartex" xmlns:mc="http://schemas.openxmlformats.org/markup-compatibility/2006" xmlns:aink="http://schemas.microsoft.com/office/drawing/2016/ink" xmlns:am3d="http://schemas.microsoft.com/office/drawing/2017/model3d" xmlns:o="urn:schemas-microsoft-com:office:office" xmlns:oel="http://schemas.microsoft.com/office/2019/extlst" xmlns:r="http://schemas.openxmlformats.org/officeDocument/2006/relationships" xmlns:m="http://schemas.openxmlformats.org/officeDocument/2006/math" xmlns:v="urn:schemas-microsoft-com:vml" xmlns:wp14="http://schemas.microsoft.com/office/word/2010/wordprocessingDrawing" xmlns:wp="http://schemas.openxmlformats.org/drawingml/2006/wordprocessingDrawing" xmlns:w10="urn:schemas-microsoft-com:office:word" xmlns:w="http://schemas.openxmlformats.org/wordprocessingml/2006/main" xmlns:w14="http://schemas.microsoft.com/office/word/2010/wordml" xmlns:w15="http://schemas.microsoft.com/office/word/2012/wordml" xmlns:w16cex="http://schemas.microsoft.com/office/word/2018/wordml/cex" xmlns:w16cid="http://schemas.microsoft.com/office/word/2016/wordml/cid" xmlns:w16="http://schemas.microsoft.com/office/word/2018/wordml" xmlns:w16sdtdh="http://schemas.microsoft.com/office/word/2020/wordml/sdtdatahash" xmlns:w16se="http://schemas.microsoft.com/office/word/2015/wordml/symex" xmlns:wpg="http://schemas.microsoft.com/office/word/2010/wordprocessingGroup" xmlns:wpi="http://schemas.microsoft.com/office/word/2010/wordprocessingInk" xmlns:wne="http://schemas.microsoft.com/office/word/2006/wordml" xmlns:wps="http://schemas.microsoft.com/office/word/2010/wordprocessingShape" mc:Ignorable="w14 w15 w16se w16cid w16 w16cex w16sdtdh wp14">
   <w:endnote w:type="separator" w:id="-1">
     <w:p>
       <w:pPr>
@@ -1701,7 +1567,7 @@
 </file>
 
 <file path=word/footer1.xml><?xml version="1.0" encoding="utf-8"?>
-<w:ftr xmlns:wpc="http://schemas.microsoft.com/office/word/2010/wordprocessingCanvas" xmlns:cx="http://schemas.microsoft.com/office/drawing/2014/chartex" xmlns:cx1="http://schemas.microsoft.com/office/drawing/2015/9/8/chartex" xmlns:cx2="http://schemas.microsoft.com/office/drawing/2015/10/21/chartex" xmlns:cx3="http://schemas.microsoft.com/office/drawing/2016/5/9/chartex" xmlns:cx4="http://schemas.microsoft.com/office/drawing/2016/5/10/chartex" xmlns:cx5="http://schemas.microsoft.com/office/drawing/2016/5/11/chartex" xmlns:cx6="http://schemas.microsoft.com/office/drawing/2016/5/12/chartex" xmlns:cx7="http://schemas.microsoft.com/office/drawing/2016/5/13/chartex" xmlns:cx8="http://schemas.microsoft.com/office/drawing/2016/5/14/chartex" xmlns:mc="http://schemas.openxmlformats.org/markup-compatibility/2006" xmlns:aink="http://schemas.microsoft.com/office/drawing/2016/ink" xmlns:am3d="http://schemas.microsoft.com/office/drawing/2017/model3d" xmlns:o="urn:schemas-microsoft-com:office:office" xmlns:r="http://schemas.openxmlformats.org/officeDocument/2006/relationships" xmlns:m="http://schemas.openxmlformats.org/officeDocument/2006/math" xmlns:v="urn:schemas-microsoft-com:vml" xmlns:wp14="http://schemas.microsoft.com/office/word/2010/wordprocessingDrawing" xmlns:wp="http://schemas.openxmlformats.org/drawingml/2006/wordprocessingDrawing" xmlns:w10="urn:schemas-microsoft-com:office:word" xmlns:w="http://schemas.openxmlformats.org/wordprocessingml/2006/main" xmlns:w14="http://schemas.microsoft.com/office/word/2010/wordml" xmlns:w15="http://schemas.microsoft.com/office/word/2012/wordml" xmlns:w16cex="http://schemas.microsoft.com/office/word/2018/wordml/cex" xmlns:w16cid="http://schemas.microsoft.com/office/word/2016/wordml/cid" xmlns:w16="http://schemas.microsoft.com/office/word/2018/wordml" xmlns:w16sdtdh="http://schemas.microsoft.com/office/word/2020/wordml/sdtdatahash" xmlns:w16se="http://schemas.microsoft.com/office/word/2015/wordml/symex" xmlns:wpg="http://schemas.microsoft.com/office/word/2010/wordprocessingGroup" xmlns:wpi="http://schemas.microsoft.com/office/word/2010/wordprocessingInk" xmlns:wne="http://schemas.microsoft.com/office/word/2006/wordml" xmlns:wps="http://schemas.microsoft.com/office/word/2010/wordprocessingShape" mc:Ignorable="w14 w15 w16se w16cid w16 w16cex w16sdtdh wp14">
+<w:ftr xmlns:wpc="http://schemas.microsoft.com/office/word/2010/wordprocessingCanvas" xmlns:cx="http://schemas.microsoft.com/office/drawing/2014/chartex" xmlns:cx1="http://schemas.microsoft.com/office/drawing/2015/9/8/chartex" xmlns:cx2="http://schemas.microsoft.com/office/drawing/2015/10/21/chartex" xmlns:cx3="http://schemas.microsoft.com/office/drawing/2016/5/9/chartex" xmlns:cx4="http://schemas.microsoft.com/office/drawing/2016/5/10/chartex" xmlns:cx5="http://schemas.microsoft.com/office/drawing/2016/5/11/chartex" xmlns:cx6="http://schemas.microsoft.com/office/drawing/2016/5/12/chartex" xmlns:cx7="http://schemas.microsoft.com/office/drawing/2016/5/13/chartex" xmlns:cx8="http://schemas.microsoft.com/office/drawing/2016/5/14/chartex" xmlns:mc="http://schemas.openxmlformats.org/markup-compatibility/2006" xmlns:aink="http://schemas.microsoft.com/office/drawing/2016/ink" xmlns:am3d="http://schemas.microsoft.com/office/drawing/2017/model3d" xmlns:o="urn:schemas-microsoft-com:office:office" xmlns:oel="http://schemas.microsoft.com/office/2019/extlst" xmlns:r="http://schemas.openxmlformats.org/officeDocument/2006/relationships" xmlns:m="http://schemas.openxmlformats.org/officeDocument/2006/math" xmlns:v="urn:schemas-microsoft-com:vml" xmlns:wp14="http://schemas.microsoft.com/office/word/2010/wordprocessingDrawing" xmlns:wp="http://schemas.openxmlformats.org/drawingml/2006/wordprocessingDrawing" xmlns:w10="urn:schemas-microsoft-com:office:word" xmlns:w="http://schemas.openxmlformats.org/wordprocessingml/2006/main" xmlns:w14="http://schemas.microsoft.com/office/word/2010/wordml" xmlns:w15="http://schemas.microsoft.com/office/word/2012/wordml" xmlns:w16cex="http://schemas.microsoft.com/office/word/2018/wordml/cex" xmlns:w16cid="http://schemas.microsoft.com/office/word/2016/wordml/cid" xmlns:w16="http://schemas.microsoft.com/office/word/2018/wordml" xmlns:w16sdtdh="http://schemas.microsoft.com/office/word/2020/wordml/sdtdatahash" xmlns:w16se="http://schemas.microsoft.com/office/word/2015/wordml/symex" xmlns:wpg="http://schemas.microsoft.com/office/word/2010/wordprocessingGroup" xmlns:wpi="http://schemas.microsoft.com/office/word/2010/wordprocessingInk" xmlns:wne="http://schemas.microsoft.com/office/word/2006/wordml" xmlns:wps="http://schemas.microsoft.com/office/word/2010/wordprocessingShape" mc:Ignorable="w14 w15 w16se w16cid w16 w16cex w16sdtdh wp14">
   <w:p>
     <w:pPr>
       <w:pStyle w:val="Footer"/>
@@ -1711,7 +1577,7 @@
 </file>
 
 <file path=word/footer2.xml><?xml version="1.0" encoding="utf-8"?>
-<w:ftr xmlns:wpc="http://schemas.microsoft.com/office/word/2010/wordprocessingCanvas" xmlns:cx="http://schemas.microsoft.com/office/drawing/2014/chartex" xmlns:cx1="http://schemas.microsoft.com/office/drawing/2015/9/8/chartex" xmlns:cx2="http://schemas.microsoft.com/office/drawing/2015/10/21/chartex" xmlns:cx3="http://schemas.microsoft.com/office/drawing/2016/5/9/chartex" xmlns:cx4="http://schemas.microsoft.com/office/drawing/2016/5/10/chartex" xmlns:cx5="http://schemas.microsoft.com/office/drawing/2016/5/11/chartex" xmlns:cx6="http://schemas.microsoft.com/office/drawing/2016/5/12/chartex" xmlns:cx7="http://schemas.microsoft.com/office/drawing/2016/5/13/chartex" xmlns:cx8="http://schemas.microsoft.com/office/drawing/2016/5/14/chartex" xmlns:mc="http://schemas.openxmlformats.org/markup-compatibility/2006" xmlns:aink="http://schemas.microsoft.com/office/drawing/2016/ink" xmlns:am3d="http://schemas.microsoft.com/office/drawing/2017/model3d" xmlns:o="urn:schemas-microsoft-com:office:office" xmlns:r="http://schemas.openxmlformats.org/officeDocument/2006/relationships" xmlns:m="http://schemas.openxmlformats.org/officeDocument/2006/math" xmlns:v="urn:schemas-microsoft-com:vml" xmlns:wp14="http://schemas.microsoft.com/office/word/2010/wordprocessingDrawing" xmlns:wp="http://schemas.openxmlformats.org/drawingml/2006/wordprocessingDrawing" xmlns:w10="urn:schemas-microsoft-com:office:word" xmlns:w="http://schemas.openxmlformats.org/wordprocessingml/2006/main" xmlns:w14="http://schemas.microsoft.com/office/word/2010/wordml" xmlns:w15="http://schemas.microsoft.com/office/word/2012/wordml" xmlns:w16cex="http://schemas.microsoft.com/office/word/2018/wordml/cex" xmlns:w16cid="http://schemas.microsoft.com/office/word/2016/wordml/cid" xmlns:w16="http://schemas.microsoft.com/office/word/2018/wordml" xmlns:w16sdtdh="http://schemas.microsoft.com/office/word/2020/wordml/sdtdatahash" xmlns:w16se="http://schemas.microsoft.com/office/word/2015/wordml/symex" xmlns:wpg="http://schemas.microsoft.com/office/word/2010/wordprocessingGroup" xmlns:wpi="http://schemas.microsoft.com/office/word/2010/wordprocessingInk" xmlns:wne="http://schemas.microsoft.com/office/word/2006/wordml" xmlns:wps="http://schemas.microsoft.com/office/word/2010/wordprocessingShape" mc:Ignorable="w14 w15 w16se w16cid w16 w16cex w16sdtdh wp14">
+<w:ftr xmlns:wpc="http://schemas.microsoft.com/office/word/2010/wordprocessingCanvas" xmlns:cx="http://schemas.microsoft.com/office/drawing/2014/chartex" xmlns:cx1="http://schemas.microsoft.com/office/drawing/2015/9/8/chartex" xmlns:cx2="http://schemas.microsoft.com/office/drawing/2015/10/21/chartex" xmlns:cx3="http://schemas.microsoft.com/office/drawing/2016/5/9/chartex" xmlns:cx4="http://schemas.microsoft.com/office/drawing/2016/5/10/chartex" xmlns:cx5="http://schemas.microsoft.com/office/drawing/2016/5/11/chartex" xmlns:cx6="http://schemas.microsoft.com/office/drawing/2016/5/12/chartex" xmlns:cx7="http://schemas.microsoft.com/office/drawing/2016/5/13/chartex" xmlns:cx8="http://schemas.microsoft.com/office/drawing/2016/5/14/chartex" xmlns:mc="http://schemas.openxmlformats.org/markup-compatibility/2006" xmlns:aink="http://schemas.microsoft.com/office/drawing/2016/ink" xmlns:am3d="http://schemas.microsoft.com/office/drawing/2017/model3d" xmlns:o="urn:schemas-microsoft-com:office:office" xmlns:oel="http://schemas.microsoft.com/office/2019/extlst" xmlns:r="http://schemas.openxmlformats.org/officeDocument/2006/relationships" xmlns:m="http://schemas.openxmlformats.org/officeDocument/2006/math" xmlns:v="urn:schemas-microsoft-com:vml" xmlns:wp14="http://schemas.microsoft.com/office/word/2010/wordprocessingDrawing" xmlns:wp="http://schemas.openxmlformats.org/drawingml/2006/wordprocessingDrawing" xmlns:w10="urn:schemas-microsoft-com:office:word" xmlns:w="http://schemas.openxmlformats.org/wordprocessingml/2006/main" xmlns:w14="http://schemas.microsoft.com/office/word/2010/wordml" xmlns:w15="http://schemas.microsoft.com/office/word/2012/wordml" xmlns:w16cex="http://schemas.microsoft.com/office/word/2018/wordml/cex" xmlns:w16cid="http://schemas.microsoft.com/office/word/2016/wordml/cid" xmlns:w16="http://schemas.microsoft.com/office/word/2018/wordml" xmlns:w16sdtdh="http://schemas.microsoft.com/office/word/2020/wordml/sdtdatahash" xmlns:w16se="http://schemas.microsoft.com/office/word/2015/wordml/symex" xmlns:wpg="http://schemas.microsoft.com/office/word/2010/wordprocessingGroup" xmlns:wpi="http://schemas.microsoft.com/office/word/2010/wordprocessingInk" xmlns:wne="http://schemas.microsoft.com/office/word/2006/wordml" xmlns:wps="http://schemas.microsoft.com/office/word/2010/wordprocessingShape" mc:Ignorable="w14 w15 w16se w16cid w16 w16cex w16sdtdh wp14">
   <w:p>
     <w:pPr>
       <w:pStyle w:val="Footer"/>
@@ -1721,7 +1587,7 @@
 </file>
 
 <file path=word/footer3.xml><?xml version="1.0" encoding="utf-8"?>
-<w:ftr xmlns:wpc="http://schemas.microsoft.com/office/word/2010/wordprocessingCanvas" xmlns:cx="http://schemas.microsoft.com/office/drawing/2014/chartex" xmlns:cx1="http://schemas.microsoft.com/office/drawing/2015/9/8/chartex" xmlns:cx2="http://schemas.microsoft.com/office/drawing/2015/10/21/chartex" xmlns:cx3="http://schemas.microsoft.com/office/drawing/2016/5/9/chartex" xmlns:cx4="http://schemas.microsoft.com/office/drawing/2016/5/10/chartex" xmlns:cx5="http://schemas.microsoft.com/office/drawing/2016/5/11/chartex" xmlns:cx6="http://schemas.microsoft.com/office/drawing/2016/5/12/chartex" xmlns:cx7="http://schemas.microsoft.com/office/drawing/2016/5/13/chartex" xmlns:cx8="http://schemas.microsoft.com/office/drawing/2016/5/14/chartex" xmlns:mc="http://schemas.openxmlformats.org/markup-compatibility/2006" xmlns:aink="http://schemas.microsoft.com/office/drawing/2016/ink" xmlns:am3d="http://schemas.microsoft.com/office/drawing/2017/model3d" xmlns:o="urn:schemas-microsoft-com:office:office" xmlns:r="http://schemas.openxmlformats.org/officeDocument/2006/relationships" xmlns:m="http://schemas.openxmlformats.org/officeDocument/2006/math" xmlns:v="urn:schemas-microsoft-com:vml" xmlns:wp14="http://schemas.microsoft.com/office/word/2010/wordprocessingDrawing" xmlns:wp="http://schemas.openxmlformats.org/drawingml/2006/wordprocessingDrawing" xmlns:w10="urn:schemas-microsoft-com:office:word" xmlns:w="http://schemas.openxmlformats.org/wordprocessingml/2006/main" xmlns:w14="http://schemas.microsoft.com/office/word/2010/wordml" xmlns:w15="http://schemas.microsoft.com/office/word/2012/wordml" xmlns:w16cex="http://schemas.microsoft.com/office/word/2018/wordml/cex" xmlns:w16cid="http://schemas.microsoft.com/office/word/2016/wordml/cid" xmlns:w16="http://schemas.microsoft.com/office/word/2018/wordml" xmlns:w16sdtdh="http://schemas.microsoft.com/office/word/2020/wordml/sdtdatahash" xmlns:w16se="http://schemas.microsoft.com/office/word/2015/wordml/symex" xmlns:wpg="http://schemas.microsoft.com/office/word/2010/wordprocessingGroup" xmlns:wpi="http://schemas.microsoft.com/office/word/2010/wordprocessingInk" xmlns:wne="http://schemas.microsoft.com/office/word/2006/wordml" xmlns:wps="http://schemas.microsoft.com/office/word/2010/wordprocessingShape" mc:Ignorable="w14 w15 w16se w16cid w16 w16cex w16sdtdh wp14">
+<w:ftr xmlns:wpc="http://schemas.microsoft.com/office/word/2010/wordprocessingCanvas" xmlns:cx="http://schemas.microsoft.com/office/drawing/2014/chartex" xmlns:cx1="http://schemas.microsoft.com/office/drawing/2015/9/8/chartex" xmlns:cx2="http://schemas.microsoft.com/office/drawing/2015/10/21/chartex" xmlns:cx3="http://schemas.microsoft.com/office/drawing/2016/5/9/chartex" xmlns:cx4="http://schemas.microsoft.com/office/drawing/2016/5/10/chartex" xmlns:cx5="http://schemas.microsoft.com/office/drawing/2016/5/11/chartex" xmlns:cx6="http://schemas.microsoft.com/office/drawing/2016/5/12/chartex" xmlns:cx7="http://schemas.microsoft.com/office/drawing/2016/5/13/chartex" xmlns:cx8="http://schemas.microsoft.com/office/drawing/2016/5/14/chartex" xmlns:mc="http://schemas.openxmlformats.org/markup-compatibility/2006" xmlns:aink="http://schemas.microsoft.com/office/drawing/2016/ink" xmlns:am3d="http://schemas.microsoft.com/office/drawing/2017/model3d" xmlns:o="urn:schemas-microsoft-com:office:office" xmlns:oel="http://schemas.microsoft.com/office/2019/extlst" xmlns:r="http://schemas.openxmlformats.org/officeDocument/2006/relationships" xmlns:m="http://schemas.openxmlformats.org/officeDocument/2006/math" xmlns:v="urn:schemas-microsoft-com:vml" xmlns:wp14="http://schemas.microsoft.com/office/word/2010/wordprocessingDrawing" xmlns:wp="http://schemas.openxmlformats.org/drawingml/2006/wordprocessingDrawing" xmlns:w10="urn:schemas-microsoft-com:office:word" xmlns:w="http://schemas.openxmlformats.org/wordprocessingml/2006/main" xmlns:w14="http://schemas.microsoft.com/office/word/2010/wordml" xmlns:w15="http://schemas.microsoft.com/office/word/2012/wordml" xmlns:w16cex="http://schemas.microsoft.com/office/word/2018/wordml/cex" xmlns:w16cid="http://schemas.microsoft.com/office/word/2016/wordml/cid" xmlns:w16="http://schemas.microsoft.com/office/word/2018/wordml" xmlns:w16sdtdh="http://schemas.microsoft.com/office/word/2020/wordml/sdtdatahash" xmlns:w16se="http://schemas.microsoft.com/office/word/2015/wordml/symex" xmlns:wpg="http://schemas.microsoft.com/office/word/2010/wordprocessingGroup" xmlns:wpi="http://schemas.microsoft.com/office/word/2010/wordprocessingInk" xmlns:wne="http://schemas.microsoft.com/office/word/2006/wordml" xmlns:wps="http://schemas.microsoft.com/office/word/2010/wordprocessingShape" mc:Ignorable="w14 w15 w16se w16cid w16 w16cex w16sdtdh wp14">
   <w:p>
     <w:pPr>
       <w:pStyle w:val="Footer"/>
@@ -1731,7 +1597,7 @@
 </file>
 
 <file path=word/footnotes.xml><?xml version="1.0" encoding="utf-8"?>
-<w:footnotes xmlns:wpc="http://schemas.microsoft.com/office/word/2010/wordprocessingCanvas" xmlns:cx="http://schemas.microsoft.com/office/drawing/2014/chartex" xmlns:cx1="http://schemas.microsoft.com/office/drawing/2015/9/8/chartex" xmlns:cx2="http://schemas.microsoft.com/office/drawing/2015/10/21/chartex" xmlns:cx3="http://schemas.microsoft.com/office/drawing/2016/5/9/chartex" xmlns:cx4="http://schemas.microsoft.com/office/drawing/2016/5/10/chartex" xmlns:cx5="http://schemas.microsoft.com/office/drawing/2016/5/11/chartex" xmlns:cx6="http://schemas.microsoft.com/office/drawing/2016/5/12/chartex" xmlns:cx7="http://schemas.microsoft.com/office/drawing/2016/5/13/chartex" xmlns:cx8="http://schemas.microsoft.com/office/drawing/2016/5/14/chartex" xmlns:mc="http://schemas.openxmlformats.org/markup-compatibility/2006" xmlns:aink="http://schemas.microsoft.com/office/drawing/2016/ink" xmlns:am3d="http://schemas.microsoft.com/office/drawing/2017/model3d" xmlns:o="urn:schemas-microsoft-com:office:office" xmlns:r="http://schemas.openxmlformats.org/officeDocument/2006/relationships" xmlns:m="http://schemas.openxmlformats.org/officeDocument/2006/math" xmlns:v="urn:schemas-microsoft-com:vml" xmlns:wp14="http://schemas.microsoft.com/office/word/2010/wordprocessingDrawing" xmlns:wp="http://schemas.openxmlformats.org/drawingml/2006/wordprocessingDrawing" xmlns:w10="urn:schemas-microsoft-com:office:word" xmlns:w="http://schemas.openxmlformats.org/wordprocessingml/2006/main" xmlns:w14="http://schemas.microsoft.com/office/word/2010/wordml" xmlns:w15="http://schemas.microsoft.com/office/word/2012/wordml" xmlns:w16cex="http://schemas.microsoft.com/office/word/2018/wordml/cex" xmlns:w16cid="http://schemas.microsoft.com/office/word/2016/wordml/cid" xmlns:w16="http://schemas.microsoft.com/office/word/2018/wordml" xmlns:w16sdtdh="http://schemas.microsoft.com/office/word/2020/wordml/sdtdatahash" xmlns:w16se="http://schemas.microsoft.com/office/word/2015/wordml/symex" xmlns:wpg="http://schemas.microsoft.com/office/word/2010/wordprocessingGroup" xmlns:wpi="http://schemas.microsoft.com/office/word/2010/wordprocessingInk" xmlns:wne="http://schemas.microsoft.com/office/word/2006/wordml" xmlns:wps="http://schemas.microsoft.com/office/word/2010/wordprocessingShape" mc:Ignorable="w14 w15 w16se w16cid w16 w16cex w16sdtdh wp14">
+<w:footnotes xmlns:wpc="http://schemas.microsoft.com/office/word/2010/wordprocessingCanvas" xmlns:cx="http://schemas.microsoft.com/office/drawing/2014/chartex" xmlns:cx1="http://schemas.microsoft.com/office/drawing/2015/9/8/chartex" xmlns:cx2="http://schemas.microsoft.com/office/drawing/2015/10/21/chartex" xmlns:cx3="http://schemas.microsoft.com/office/drawing/2016/5/9/chartex" xmlns:cx4="http://schemas.microsoft.com/office/drawing/2016/5/10/chartex" xmlns:cx5="http://schemas.microsoft.com/office/drawing/2016/5/11/chartex" xmlns:cx6="http://schemas.microsoft.com/office/drawing/2016/5/12/chartex" xmlns:cx7="http://schemas.microsoft.com/office/drawing/2016/5/13/chartex" xmlns:cx8="http://schemas.microsoft.com/office/drawing/2016/5/14/chartex" xmlns:mc="http://schemas.openxmlformats.org/markup-compatibility/2006" xmlns:aink="http://schemas.microsoft.com/office/drawing/2016/ink" xmlns:am3d="http://schemas.microsoft.com/office/drawing/2017/model3d" xmlns:o="urn:schemas-microsoft-com:office:office" xmlns:oel="http://schemas.microsoft.com/office/2019/extlst" xmlns:r="http://schemas.openxmlformats.org/officeDocument/2006/relationships" xmlns:m="http://schemas.openxmlformats.org/officeDocument/2006/math" xmlns:v="urn:schemas-microsoft-com:vml" xmlns:wp14="http://schemas.microsoft.com/office/word/2010/wordprocessingDrawing" xmlns:wp="http://schemas.openxmlformats.org/drawingml/2006/wordprocessingDrawing" xmlns:w10="urn:schemas-microsoft-com:office:word" xmlns:w="http://schemas.openxmlformats.org/wordprocessingml/2006/main" xmlns:w14="http://schemas.microsoft.com/office/word/2010/wordml" xmlns:w15="http://schemas.microsoft.com/office/word/2012/wordml" xmlns:w16cex="http://schemas.microsoft.com/office/word/2018/wordml/cex" xmlns:w16cid="http://schemas.microsoft.com/office/word/2016/wordml/cid" xmlns:w16="http://schemas.microsoft.com/office/word/2018/wordml" xmlns:w16sdtdh="http://schemas.microsoft.com/office/word/2020/wordml/sdtdatahash" xmlns:w16se="http://schemas.microsoft.com/office/word/2015/wordml/symex" xmlns:wpg="http://schemas.microsoft.com/office/word/2010/wordprocessingGroup" xmlns:wpi="http://schemas.microsoft.com/office/word/2010/wordprocessingInk" xmlns:wne="http://schemas.microsoft.com/office/word/2006/wordml" xmlns:wps="http://schemas.microsoft.com/office/word/2010/wordprocessingShape" mc:Ignorable="w14 w15 w16se w16cid w16 w16cex w16sdtdh wp14">
   <w:footnote w:type="separator" w:id="-1">
     <w:p>
       <w:pPr>
@@ -1756,7 +1622,7 @@
 </file>
 
 <file path=word/header1.xml><?xml version="1.0" encoding="utf-8"?>
-<w:hdr xmlns:wpc="http://schemas.microsoft.com/office/word/2010/wordprocessingCanvas" xmlns:cx="http://schemas.microsoft.com/office/drawing/2014/chartex" xmlns:cx1="http://schemas.microsoft.com/office/drawing/2015/9/8/chartex" xmlns:cx2="http://schemas.microsoft.com/office/drawing/2015/10/21/chartex" xmlns:cx3="http://schemas.microsoft.com/office/drawing/2016/5/9/chartex" xmlns:cx4="http://schemas.microsoft.com/office/drawing/2016/5/10/chartex" xmlns:cx5="http://schemas.microsoft.com/office/drawing/2016/5/11/chartex" xmlns:cx6="http://schemas.microsoft.com/office/drawing/2016/5/12/chartex" xmlns:cx7="http://schemas.microsoft.com/office/drawing/2016/5/13/chartex" xmlns:cx8="http://schemas.microsoft.com/office/drawing/2016/5/14/chartex" xmlns:mc="http://schemas.openxmlformats.org/markup-compatibility/2006" xmlns:aink="http://schemas.microsoft.com/office/drawing/2016/ink" xmlns:am3d="http://schemas.microsoft.com/office/drawing/2017/model3d" xmlns:o="urn:schemas-microsoft-com:office:office" xmlns:r="http://schemas.openxmlformats.org/officeDocument/2006/relationships" xmlns:m="http://schemas.openxmlformats.org/officeDocument/2006/math" xmlns:v="urn:schemas-microsoft-com:vml" xmlns:wp14="http://schemas.microsoft.com/office/word/2010/wordprocessingDrawing" xmlns:wp="http://schemas.openxmlformats.org/drawingml/2006/wordprocessingDrawing" xmlns:w10="urn:schemas-microsoft-com:office:word" xmlns:w="http://schemas.openxmlformats.org/wordprocessingml/2006/main" xmlns:w14="http://schemas.microsoft.com/office/word/2010/wordml" xmlns:w15="http://schemas.microsoft.com/office/word/2012/wordml" xmlns:w16cex="http://schemas.microsoft.com/office/word/2018/wordml/cex" xmlns:w16cid="http://schemas.microsoft.com/office/word/2016/wordml/cid" xmlns:w16="http://schemas.microsoft.com/office/word/2018/wordml" xmlns:w16sdtdh="http://schemas.microsoft.com/office/word/2020/wordml/sdtdatahash" xmlns:w16se="http://schemas.microsoft.com/office/word/2015/wordml/symex" xmlns:wpg="http://schemas.microsoft.com/office/word/2010/wordprocessingGroup" xmlns:wpi="http://schemas.microsoft.com/office/word/2010/wordprocessingInk" xmlns:wne="http://schemas.microsoft.com/office/word/2006/wordml" xmlns:wps="http://schemas.microsoft.com/office/word/2010/wordprocessingShape" mc:Ignorable="w14 w15 w16se w16cid w16 w16cex w16sdtdh wp14">
+<w:hdr xmlns:wpc="http://schemas.microsoft.com/office/word/2010/wordprocessingCanvas" xmlns:cx="http://schemas.microsoft.com/office/drawing/2014/chartex" xmlns:cx1="http://schemas.microsoft.com/office/drawing/2015/9/8/chartex" xmlns:cx2="http://schemas.microsoft.com/office/drawing/2015/10/21/chartex" xmlns:cx3="http://schemas.microsoft.com/office/drawing/2016/5/9/chartex" xmlns:cx4="http://schemas.microsoft.com/office/drawing/2016/5/10/chartex" xmlns:cx5="http://schemas.microsoft.com/office/drawing/2016/5/11/chartex" xmlns:cx6="http://schemas.microsoft.com/office/drawing/2016/5/12/chartex" xmlns:cx7="http://schemas.microsoft.com/office/drawing/2016/5/13/chartex" xmlns:cx8="http://schemas.microsoft.com/office/drawing/2016/5/14/chartex" xmlns:mc="http://schemas.openxmlformats.org/markup-compatibility/2006" xmlns:aink="http://schemas.microsoft.com/office/drawing/2016/ink" xmlns:am3d="http://schemas.microsoft.com/office/drawing/2017/model3d" xmlns:o="urn:schemas-microsoft-com:office:office" xmlns:oel="http://schemas.microsoft.com/office/2019/extlst" xmlns:r="http://schemas.openxmlformats.org/officeDocument/2006/relationships" xmlns:m="http://schemas.openxmlformats.org/officeDocument/2006/math" xmlns:v="urn:schemas-microsoft-com:vml" xmlns:wp14="http://schemas.microsoft.com/office/word/2010/wordprocessingDrawing" xmlns:wp="http://schemas.openxmlformats.org/drawingml/2006/wordprocessingDrawing" xmlns:w10="urn:schemas-microsoft-com:office:word" xmlns:w="http://schemas.openxmlformats.org/wordprocessingml/2006/main" xmlns:w14="http://schemas.microsoft.com/office/word/2010/wordml" xmlns:w15="http://schemas.microsoft.com/office/word/2012/wordml" xmlns:w16cex="http://schemas.microsoft.com/office/word/2018/wordml/cex" xmlns:w16cid="http://schemas.microsoft.com/office/word/2016/wordml/cid" xmlns:w16="http://schemas.microsoft.com/office/word/2018/wordml" xmlns:w16sdtdh="http://schemas.microsoft.com/office/word/2020/wordml/sdtdatahash" xmlns:w16se="http://schemas.microsoft.com/office/word/2015/wordml/symex" xmlns:wpg="http://schemas.microsoft.com/office/word/2010/wordprocessingGroup" xmlns:wpi="http://schemas.microsoft.com/office/word/2010/wordprocessingInk" xmlns:wne="http://schemas.microsoft.com/office/word/2006/wordml" xmlns:wps="http://schemas.microsoft.com/office/word/2010/wordprocessingShape" mc:Ignorable="w14 w15 w16se w16cid w16 w16cex w16sdtdh wp14">
   <w:p>
     <w:pPr>
       <w:pStyle w:val="Header"/>
@@ -1766,7 +1632,7 @@
 </file>
 
 <file path=word/header2.xml><?xml version="1.0" encoding="utf-8"?>
-<w:hdr xmlns:wpc="http://schemas.microsoft.com/office/word/2010/wordprocessingCanvas" xmlns:cx="http://schemas.microsoft.com/office/drawing/2014/chartex" xmlns:cx1="http://schemas.microsoft.com/office/drawing/2015/9/8/chartex" xmlns:cx2="http://schemas.microsoft.com/office/drawing/2015/10/21/chartex" xmlns:cx3="http://schemas.microsoft.com/office/drawing/2016/5/9/chartex" xmlns:cx4="http://schemas.microsoft.com/office/drawing/2016/5/10/chartex" xmlns:cx5="http://schemas.microsoft.com/office/drawing/2016/5/11/chartex" xmlns:cx6="http://schemas.microsoft.com/office/drawing/2016/5/12/chartex" xmlns:cx7="http://schemas.microsoft.com/office/drawing/2016/5/13/chartex" xmlns:cx8="http://schemas.microsoft.com/office/drawing/2016/5/14/chartex" xmlns:mc="http://schemas.openxmlformats.org/markup-compatibility/2006" xmlns:aink="http://schemas.microsoft.com/office/drawing/2016/ink" xmlns:am3d="http://schemas.microsoft.com/office/drawing/2017/model3d" xmlns:o="urn:schemas-microsoft-com:office:office" xmlns:r="http://schemas.openxmlformats.org/officeDocument/2006/relationships" xmlns:m="http://schemas.openxmlformats.org/officeDocument/2006/math" xmlns:v="urn:schemas-microsoft-com:vml" xmlns:wp14="http://schemas.microsoft.com/office/word/2010/wordprocessingDrawing" xmlns:wp="http://schemas.openxmlformats.org/drawingml/2006/wordprocessingDrawing" xmlns:w10="urn:schemas-microsoft-com:office:word" xmlns:w="http://schemas.openxmlformats.org/wordprocessingml/2006/main" xmlns:w14="http://schemas.microsoft.com/office/word/2010/wordml" xmlns:w15="http://schemas.microsoft.com/office/word/2012/wordml" xmlns:w16cex="http://schemas.microsoft.com/office/word/2018/wordml/cex" xmlns:w16cid="http://schemas.microsoft.com/office/word/2016/wordml/cid" xmlns:w16="http://schemas.microsoft.com/office/word/2018/wordml" xmlns:w16sdtdh="http://schemas.microsoft.com/office/word/2020/wordml/sdtdatahash" xmlns:w16se="http://schemas.microsoft.com/office/word/2015/wordml/symex" xmlns:wpg="http://schemas.microsoft.com/office/word/2010/wordprocessingGroup" xmlns:wpi="http://schemas.microsoft.com/office/word/2010/wordprocessingInk" xmlns:wne="http://schemas.microsoft.com/office/word/2006/wordml" xmlns:wps="http://schemas.microsoft.com/office/word/2010/wordprocessingShape" mc:Ignorable="w14 w15 w16se w16cid w16 w16cex w16sdtdh wp14">
+<w:hdr xmlns:wpc="http://schemas.microsoft.com/office/word/2010/wordprocessingCanvas" xmlns:cx="http://schemas.microsoft.com/office/drawing/2014/chartex" xmlns:cx1="http://schemas.microsoft.com/office/drawing/2015/9/8/chartex" xmlns:cx2="http://schemas.microsoft.com/office/drawing/2015/10/21/chartex" xmlns:cx3="http://schemas.microsoft.com/office/drawing/2016/5/9/chartex" xmlns:cx4="http://schemas.microsoft.com/office/drawing/2016/5/10/chartex" xmlns:cx5="http://schemas.microsoft.com/office/drawing/2016/5/11/chartex" xmlns:cx6="http://schemas.microsoft.com/office/drawing/2016/5/12/chartex" xmlns:cx7="http://schemas.microsoft.com/office/drawing/2016/5/13/chartex" xmlns:cx8="http://schemas.microsoft.com/office/drawing/2016/5/14/chartex" xmlns:mc="http://schemas.openxmlformats.org/markup-compatibility/2006" xmlns:aink="http://schemas.microsoft.com/office/drawing/2016/ink" xmlns:am3d="http://schemas.microsoft.com/office/drawing/2017/model3d" xmlns:o="urn:schemas-microsoft-com:office:office" xmlns:oel="http://schemas.microsoft.com/office/2019/extlst" xmlns:r="http://schemas.openxmlformats.org/officeDocument/2006/relationships" xmlns:m="http://schemas.openxmlformats.org/officeDocument/2006/math" xmlns:v="urn:schemas-microsoft-com:vml" xmlns:wp14="http://schemas.microsoft.com/office/word/2010/wordprocessingDrawing" xmlns:wp="http://schemas.openxmlformats.org/drawingml/2006/wordprocessingDrawing" xmlns:w10="urn:schemas-microsoft-com:office:word" xmlns:w="http://schemas.openxmlformats.org/wordprocessingml/2006/main" xmlns:w14="http://schemas.microsoft.com/office/word/2010/wordml" xmlns:w15="http://schemas.microsoft.com/office/word/2012/wordml" xmlns:w16cex="http://schemas.microsoft.com/office/word/2018/wordml/cex" xmlns:w16cid="http://schemas.microsoft.com/office/word/2016/wordml/cid" xmlns:w16="http://schemas.microsoft.com/office/word/2018/wordml" xmlns:w16sdtdh="http://schemas.microsoft.com/office/word/2020/wordml/sdtdatahash" xmlns:w16se="http://schemas.microsoft.com/office/word/2015/wordml/symex" xmlns:wpg="http://schemas.microsoft.com/office/word/2010/wordprocessingGroup" xmlns:wpi="http://schemas.microsoft.com/office/word/2010/wordprocessingInk" xmlns:wne="http://schemas.microsoft.com/office/word/2006/wordml" xmlns:wps="http://schemas.microsoft.com/office/word/2010/wordprocessingShape" mc:Ignorable="w14 w15 w16se w16cid w16 w16cex w16sdtdh wp14">
   <w:p>
     <w:pPr>
       <w:pStyle w:val="Header"/>
@@ -1776,7 +1642,7 @@
 </file>
 
 <file path=word/header3.xml><?xml version="1.0" encoding="utf-8"?>
-<w:hdr xmlns:wpc="http://schemas.microsoft.com/office/word/2010/wordprocessingCanvas" xmlns:cx="http://schemas.microsoft.com/office/drawing/2014/chartex" xmlns:cx1="http://schemas.microsoft.com/office/drawing/2015/9/8/chartex" xmlns:cx2="http://schemas.microsoft.com/office/drawing/2015/10/21/chartex" xmlns:cx3="http://schemas.microsoft.com/office/drawing/2016/5/9/chartex" xmlns:cx4="http://schemas.microsoft.com/office/drawing/2016/5/10/chartex" xmlns:cx5="http://schemas.microsoft.com/office/drawing/2016/5/11/chartex" xmlns:cx6="http://schemas.microsoft.com/office/drawing/2016/5/12/chartex" xmlns:cx7="http://schemas.microsoft.com/office/drawing/2016/5/13/chartex" xmlns:cx8="http://schemas.microsoft.com/office/drawing/2016/5/14/chartex" xmlns:mc="http://schemas.openxmlformats.org/markup-compatibility/2006" xmlns:aink="http://schemas.microsoft.com/office/drawing/2016/ink" xmlns:am3d="http://schemas.microsoft.com/office/drawing/2017/model3d" xmlns:o="urn:schemas-microsoft-com:office:office" xmlns:r="http://schemas.openxmlformats.org/officeDocument/2006/relationships" xmlns:m="http://schemas.openxmlformats.org/officeDocument/2006/math" xmlns:v="urn:schemas-microsoft-com:vml" xmlns:wp14="http://schemas.microsoft.com/office/word/2010/wordprocessingDrawing" xmlns:wp="http://schemas.openxmlformats.org/drawingml/2006/wordprocessingDrawing" xmlns:w10="urn:schemas-microsoft-com:office:word" xmlns:w="http://schemas.openxmlformats.org/wordprocessingml/2006/main" xmlns:w14="http://schemas.microsoft.com/office/word/2010/wordml" xmlns:w15="http://schemas.microsoft.com/office/word/2012/wordml" xmlns:w16cex="http://schemas.microsoft.com/office/word/2018/wordml/cex" xmlns:w16cid="http://schemas.microsoft.com/office/word/2016/wordml/cid" xmlns:w16="http://schemas.microsoft.com/office/word/2018/wordml" xmlns:w16sdtdh="http://schemas.microsoft.com/office/word/2020/wordml/sdtdatahash" xmlns:w16se="http://schemas.microsoft.com/office/word/2015/wordml/symex" xmlns:wpg="http://schemas.microsoft.com/office/word/2010/wordprocessingGroup" xmlns:wpi="http://schemas.microsoft.com/office/word/2010/wordprocessingInk" xmlns:wne="http://schemas.microsoft.com/office/word/2006/wordml" xmlns:wps="http://schemas.microsoft.com/office/word/2010/wordprocessingShape" mc:Ignorable="w14 w15 w16se w16cid w16 w16cex w16sdtdh wp14">
+<w:hdr xmlns:wpc="http://schemas.microsoft.com/office/word/2010/wordprocessingCanvas" xmlns:cx="http://schemas.microsoft.com/office/drawing/2014/chartex" xmlns:cx1="http://schemas.microsoft.com/office/drawing/2015/9/8/chartex" xmlns:cx2="http://schemas.microsoft.com/office/drawing/2015/10/21/chartex" xmlns:cx3="http://schemas.microsoft.com/office/drawing/2016/5/9/chartex" xmlns:cx4="http://schemas.microsoft.com/office/drawing/2016/5/10/chartex" xmlns:cx5="http://schemas.microsoft.com/office/drawing/2016/5/11/chartex" xmlns:cx6="http://schemas.microsoft.com/office/drawing/2016/5/12/chartex" xmlns:cx7="http://schemas.microsoft.com/office/drawing/2016/5/13/chartex" xmlns:cx8="http://schemas.microsoft.com/office/drawing/2016/5/14/chartex" xmlns:mc="http://schemas.openxmlformats.org/markup-compatibility/2006" xmlns:aink="http://schemas.microsoft.com/office/drawing/2016/ink" xmlns:am3d="http://schemas.microsoft.com/office/drawing/2017/model3d" xmlns:o="urn:schemas-microsoft-com:office:office" xmlns:oel="http://schemas.microsoft.com/office/2019/extlst" xmlns:r="http://schemas.openxmlformats.org/officeDocument/2006/relationships" xmlns:m="http://schemas.openxmlformats.org/officeDocument/2006/math" xmlns:v="urn:schemas-microsoft-com:vml" xmlns:wp14="http://schemas.microsoft.com/office/word/2010/wordprocessingDrawing" xmlns:wp="http://schemas.openxmlformats.org/drawingml/2006/wordprocessingDrawing" xmlns:w10="urn:schemas-microsoft-com:office:word" xmlns:w="http://schemas.openxmlformats.org/wordprocessingml/2006/main" xmlns:w14="http://schemas.microsoft.com/office/word/2010/wordml" xmlns:w15="http://schemas.microsoft.com/office/word/2012/wordml" xmlns:w16cex="http://schemas.microsoft.com/office/word/2018/wordml/cex" xmlns:w16cid="http://schemas.microsoft.com/office/word/2016/wordml/cid" xmlns:w16="http://schemas.microsoft.com/office/word/2018/wordml" xmlns:w16sdtdh="http://schemas.microsoft.com/office/word/2020/wordml/sdtdatahash" xmlns:w16se="http://schemas.microsoft.com/office/word/2015/wordml/symex" xmlns:wpg="http://schemas.microsoft.com/office/word/2010/wordprocessingGroup" xmlns:wpi="http://schemas.microsoft.com/office/word/2010/wordprocessingInk" xmlns:wne="http://schemas.microsoft.com/office/word/2006/wordml" xmlns:wps="http://schemas.microsoft.com/office/word/2010/wordprocessingShape" mc:Ignorable="w14 w15 w16se w16cid w16 w16cex w16sdtdh wp14">
   <w:p>
     <w:pPr>
       <w:pStyle w:val="Header"/>
@@ -1786,7 +1652,7 @@
 </file>
 
 <file path=word/numbering.xml><?xml version="1.0" encoding="utf-8"?>
-<w:numbering xmlns:wpc="http://schemas.microsoft.com/office/word/2010/wordprocessingCanvas" xmlns:cx="http://schemas.microsoft.com/office/drawing/2014/chartex" xmlns:cx1="http://schemas.microsoft.com/office/drawing/2015/9/8/chartex" xmlns:cx2="http://schemas.microsoft.com/office/drawing/2015/10/21/chartex" xmlns:cx3="http://schemas.microsoft.com/office/drawing/2016/5/9/chartex" xmlns:cx4="http://schemas.microsoft.com/office/drawing/2016/5/10/chartex" xmlns:cx5="http://schemas.microsoft.com/office/drawing/2016/5/11/chartex" xmlns:cx6="http://schemas.microsoft.com/office/drawing/2016/5/12/chartex" xmlns:cx7="http://schemas.microsoft.com/office/drawing/2016/5/13/chartex" xmlns:cx8="http://schemas.microsoft.com/office/drawing/2016/5/14/chartex" xmlns:mc="http://schemas.openxmlformats.org/markup-compatibility/2006" xmlns:aink="http://schemas.microsoft.com/office/drawing/2016/ink" xmlns:am3d="http://schemas.microsoft.com/office/drawing/2017/model3d" xmlns:o="urn:schemas-microsoft-com:office:office" xmlns:r="http://schemas.openxmlformats.org/officeDocument/2006/relationships" xmlns:m="http://schemas.openxmlformats.org/officeDocument/2006/math" xmlns:v="urn:schemas-microsoft-com:vml" xmlns:wp14="http://schemas.microsoft.com/office/word/2010/wordprocessingDrawing" xmlns:wp="http://schemas.openxmlformats.org/drawingml/2006/wordprocessingDrawing" xmlns:w10="urn:schemas-microsoft-com:office:word" xmlns:w="http://schemas.openxmlformats.org/wordprocessingml/2006/main" xmlns:w14="http://schemas.microsoft.com/office/word/2010/wordml" xmlns:w15="http://schemas.microsoft.com/office/word/2012/wordml" xmlns:w16cex="http://schemas.microsoft.com/office/word/2018/wordml/cex" xmlns:w16cid="http://schemas.microsoft.com/office/word/2016/wordml/cid" xmlns:w16="http://schemas.microsoft.com/office/word/2018/wordml" xmlns:w16sdtdh="http://schemas.microsoft.com/office/word/2020/wordml/sdtdatahash" xmlns:w16se="http://schemas.microsoft.com/office/word/2015/wordml/symex" xmlns:wpg="http://schemas.microsoft.com/office/word/2010/wordprocessingGroup" xmlns:wpi="http://schemas.microsoft.com/office/word/2010/wordprocessingInk" xmlns:wne="http://schemas.microsoft.com/office/word/2006/wordml" xmlns:wps="http://schemas.microsoft.com/office/word/2010/wordprocessingShape" mc:Ignorable="w14 w15 w16se w16cid w16 w16cex w16sdtdh wp14">
+<w:numbering xmlns:wpc="http://schemas.microsoft.com/office/word/2010/wordprocessingCanvas" xmlns:cx="http://schemas.microsoft.com/office/drawing/2014/chartex" xmlns:cx1="http://schemas.microsoft.com/office/drawing/2015/9/8/chartex" xmlns:cx2="http://schemas.microsoft.com/office/drawing/2015/10/21/chartex" xmlns:cx3="http://schemas.microsoft.com/office/drawing/2016/5/9/chartex" xmlns:cx4="http://schemas.microsoft.com/office/drawing/2016/5/10/chartex" xmlns:cx5="http://schemas.microsoft.com/office/drawing/2016/5/11/chartex" xmlns:cx6="http://schemas.microsoft.com/office/drawing/2016/5/12/chartex" xmlns:cx7="http://schemas.microsoft.com/office/drawing/2016/5/13/chartex" xmlns:cx8="http://schemas.microsoft.com/office/drawing/2016/5/14/chartex" xmlns:mc="http://schemas.openxmlformats.org/markup-compatibility/2006" xmlns:aink="http://schemas.microsoft.com/office/drawing/2016/ink" xmlns:am3d="http://schemas.microsoft.com/office/drawing/2017/model3d" xmlns:o="urn:schemas-microsoft-com:office:office" xmlns:oel="http://schemas.microsoft.com/office/2019/extlst" xmlns:r="http://schemas.openxmlformats.org/officeDocument/2006/relationships" xmlns:m="http://schemas.openxmlformats.org/officeDocument/2006/math" xmlns:v="urn:schemas-microsoft-com:vml" xmlns:wp14="http://schemas.microsoft.com/office/word/2010/wordprocessingDrawing" xmlns:wp="http://schemas.openxmlformats.org/drawingml/2006/wordprocessingDrawing" xmlns:w10="urn:schemas-microsoft-com:office:word" xmlns:w="http://schemas.openxmlformats.org/wordprocessingml/2006/main" xmlns:w14="http://schemas.microsoft.com/office/word/2010/wordml" xmlns:w15="http://schemas.microsoft.com/office/word/2012/wordml" xmlns:w16cex="http://schemas.microsoft.com/office/word/2018/wordml/cex" xmlns:w16cid="http://schemas.microsoft.com/office/word/2016/wordml/cid" xmlns:w16="http://schemas.microsoft.com/office/word/2018/wordml" xmlns:w16sdtdh="http://schemas.microsoft.com/office/word/2020/wordml/sdtdatahash" xmlns:w16se="http://schemas.microsoft.com/office/word/2015/wordml/symex" xmlns:wpg="http://schemas.microsoft.com/office/word/2010/wordprocessingGroup" xmlns:wpi="http://schemas.microsoft.com/office/word/2010/wordprocessingInk" xmlns:wne="http://schemas.microsoft.com/office/word/2006/wordml" xmlns:wps="http://schemas.microsoft.com/office/word/2010/wordprocessingShape" mc:Ignorable="w14 w15 w16se w16cid w16 w16cex w16sdtdh wp14">
   <w:abstractNum w:abstractNumId="0" w15:restartNumberingAfterBreak="0">
     <w:nsid w:val="035F0BA1"/>
     <w:multiLevelType w:val="multilevel"/>
@@ -2603,31 +2469,31 @@
       </w:pPr>
     </w:lvl>
   </w:abstractNum>
-  <w:num w:numId="1">
+  <w:num w:numId="1" w16cid:durableId="1507092378">
     <w:abstractNumId w:val="6"/>
   </w:num>
-  <w:num w:numId="2">
+  <w:num w:numId="2" w16cid:durableId="1317077669">
     <w:abstractNumId w:val="0"/>
   </w:num>
-  <w:num w:numId="3">
+  <w:num w:numId="3" w16cid:durableId="701981655">
     <w:abstractNumId w:val="5"/>
   </w:num>
-  <w:num w:numId="4">
+  <w:num w:numId="4" w16cid:durableId="87234763">
     <w:abstractNumId w:val="2"/>
   </w:num>
-  <w:num w:numId="5">
+  <w:num w:numId="5" w16cid:durableId="609581223">
     <w:abstractNumId w:val="4"/>
   </w:num>
-  <w:num w:numId="6">
+  <w:num w:numId="6" w16cid:durableId="263534123">
     <w:abstractNumId w:val="3"/>
   </w:num>
-  <w:num w:numId="7">
+  <w:num w:numId="7" w16cid:durableId="1491753401">
     <w:abstractNumId w:val="8"/>
   </w:num>
-  <w:num w:numId="8">
+  <w:num w:numId="8" w16cid:durableId="25495187">
     <w:abstractNumId w:val="1"/>
   </w:num>
-  <w:num w:numId="9">
+  <w:num w:numId="9" w16cid:durableId="494031479">
     <w:abstractNumId w:val="7"/>
   </w:num>
 </w:numbering>
@@ -3557,6 +3423,40 @@
       <w:contextualSpacing/>
     </w:pPr>
   </w:style>
+  <w:style w:type="paragraph" w:styleId="Title">
+    <w:name w:val="Title"/>
+    <w:basedOn w:val="Normal"/>
+    <w:next w:val="Normal"/>
+    <w:link w:val="TitleChar"/>
+    <w:uiPriority w:val="10"/>
+    <w:qFormat/>
+    <w:rsid w:val="008856AE"/>
+    <w:pPr>
+      <w:spacing w:after="0" w:line="240" w:lineRule="auto"/>
+      <w:contextualSpacing/>
+    </w:pPr>
+    <w:rPr>
+      <w:rFonts w:asciiTheme="majorHAnsi" w:eastAsiaTheme="majorEastAsia" w:hAnsiTheme="majorHAnsi" w:cstheme="majorBidi"/>
+      <w:spacing w:val="-10"/>
+      <w:kern w:val="28"/>
+      <w:sz w:val="56"/>
+      <w:szCs w:val="56"/>
+    </w:rPr>
+  </w:style>
+  <w:style w:type="character" w:customStyle="1" w:styleId="TitleChar">
+    <w:name w:val="Title Char"/>
+    <w:basedOn w:val="DefaultParagraphFont"/>
+    <w:link w:val="Title"/>
+    <w:uiPriority w:val="10"/>
+    <w:rsid w:val="008856AE"/>
+    <w:rPr>
+      <w:rFonts w:asciiTheme="majorHAnsi" w:eastAsiaTheme="majorEastAsia" w:hAnsiTheme="majorHAnsi" w:cstheme="majorBidi"/>
+      <w:spacing w:val="-10"/>
+      <w:kern w:val="28"/>
+      <w:sz w:val="56"/>
+      <w:szCs w:val="56"/>
+    </w:rPr>
+  </w:style>
 </w:styles>
 </file>
 

</xml_diff>